<commit_message>
release: 0.4.0 validated analysis workflows and lightweight installation
</commit_message>
<xml_diff>
--- a/docs/INTRODUCTION.docx
+++ b/docs/INTRODUCTION.docx
@@ -1269,31 +1269,7 @@
         <w:pStyle w:val="BlockText"/>
       </w:pPr>
       <w:r>
-        <w:t xml:space="preserve">高级分析（解码/连接性/源定位）需安装</w:t>
-      </w:r>
-      <w:r>
-        <w:t xml:space="preserve"> </w:t>
-      </w:r>
-      <w:r>
-        <w:rPr>
-          <w:rStyle w:val="VerbatimChar"/>
-        </w:rPr>
-        <w:t xml:space="preserve">[full]</w:t>
-      </w:r>
-      <w:r>
-        <w:t xml:space="preserve"> </w:t>
-      </w:r>
-      <w:r>
-        <w:t xml:space="preserve">额外依赖：</w:t>
-      </w:r>
-      <w:r>
-        <w:rPr>
-          <w:rStyle w:val="VerbatimChar"/>
-        </w:rPr>
-        <w:t xml:space="preserve">pip install -e ".[full]"</w:t>
-      </w:r>
-      <w:r>
-        <w:t xml:space="preserve">。</w:t>
+        <w:t>唯一安装器会一次安装解码、连接性和源定位等结构化高级工具所需依赖。</w:t>
       </w:r>
     </w:p>
     <w:p>
@@ -1679,7 +1655,7 @@
         </w:numPr>
       </w:pPr>
       <w:r>
-        <w:t xml:space="preserve">Python 3.10+；MNE-Python ≥ 1.6；NumPy / SciPy / Matplotlib / pandas；scikit-learn（ICA）。</w:t>
+        <w:t>Python 3.12；MNE-Python、NumPy、SciPy、Matplotlib、pandas 与 scikit-learn 由唯一安装器统一安装。</w:t>
       </w:r>
     </w:p>
     <w:p>

</xml_diff>